<commit_message>
feat: Add new data as  performance evidence
</commit_message>
<xml_diff>
--- a/docs/AI_추천가_시스템_기술문서.docx
+++ b/docs/AI_추천가_시스템_기술문서.docx
@@ -59,7 +59,7 @@
           <w:szCs w:val="20"/>
           <w:color w:val="777777"/>
         </w:rPr>
-        <w:t xml:space="preserve">문서 기준일  2026-07-16</w:t>
+        <w:t xml:space="preserve">문서 기준일  2026-09-16</w:t>
       </w:r>
     </w:p>
     <w:p>
@@ -74,7 +74,7 @@
           <w:szCs w:val="20"/>
           <w:color w:val="777777"/>
         </w:rPr>
-        <w:t xml:space="preserve">운영 모델  jeju-daily-flow-ebm-2026.07.1 + kma-jeju-pricing-2026.07.5</w:t>
+        <w:t xml:space="preserve">운영 모델  jeju-daily-flow-ebm-2026.07.1 + persona-calibrated-pricing-2026.09.1</w:t>
       </w:r>
     </w:p>
     <w:p>
@@ -5805,7 +5805,7 @@
           <w:szCs w:val="18"/>
           <w:color w:val="333333"/>
         </w:rPr>
-        <w:t xml:space="preserve">    0.08</w:t>
+        <w:t xml:space="preserve">    0.10417</w:t>
       </w:r>
     </w:p>
     <w:p>
@@ -5821,7 +5821,7 @@
           <w:szCs w:val="18"/>
           <w:color w:val="333333"/>
         </w:rPr>
-        <w:t xml:space="preserve">  + (1 - demand_percentile) × 0.12</w:t>
+        <w:t xml:space="preserve">  + (1 - demand_percentile) × 0.18882</w:t>
       </w:r>
     </w:p>
     <w:p>
@@ -5837,7 +5837,7 @@
           <w:szCs w:val="18"/>
           <w:color w:val="333333"/>
         </w:rPr>
-        <w:t xml:space="preserve">  + remaining_ratio × 0.10</w:t>
+        <w:t xml:space="preserve">  + remaining_ratio × 0.21873</w:t>
       </w:r>
     </w:p>
     <w:p>
@@ -5853,7 +5853,7 @@
           <w:szCs w:val="18"/>
           <w:color w:val="333333"/>
         </w:rPr>
-        <w:t xml:space="preserve">  - sales_velocity × 0.12</w:t>
+        <w:t xml:space="preserve">  - sales_velocity × 0.11487</w:t>
       </w:r>
     </w:p>
     <w:p>
@@ -5869,7 +5869,7 @@
           <w:szCs w:val="18"/>
           <w:color w:val="333333"/>
         </w:rPr>
-        <w:t xml:space="preserve">  + elapsed_ratio × 0.15</w:t>
+        <w:t xml:space="preserve">  + elapsed_ratio × 0.10391</w:t>
       </w:r>
     </w:p>
     <w:p>
@@ -5885,7 +5885,7 @@
           <w:szCs w:val="18"/>
           <w:color w:val="333333"/>
         </w:rPr>
-        <w:t xml:space="preserve">  + weather_score × (0.03 + 0.07 × outdoor)</w:t>
+        <w:t xml:space="preserve">  + weather_score × (0.00136 + 0.14330 × outdoor)</w:t>
       </w:r>
     </w:p>
     <w:p>
@@ -5901,7 +5901,7 @@
           <w:szCs w:val="18"/>
           <w:color w:val="333333"/>
         </w:rPr>
-        <w:t xml:space="preserve">  - weekend × 0.025</w:t>
+        <w:t xml:space="preserve">  - weekend × 0.07889</w:t>
       </w:r>
     </w:p>
     <w:p>
@@ -5917,7 +5917,7 @@
           <w:szCs w:val="18"/>
           <w:color w:val="333333"/>
         </w:rPr>
-        <w:t xml:space="preserve">  - peak_hour × 0.02</w:t>
+        <w:t xml:space="preserve">  - peak_hour × 0.00284</w:t>
       </w:r>
     </w:p>
     <w:p>
@@ -6602,7 +6602,7 @@
                 <w:szCs w:val="18"/>
                 <w:color w:val="222222"/>
               </w:rPr>
-              <w:t xml:space="preserve">날씨계수 0.10, 일반 상품 0.03</w:t>
+              <w:t xml:space="preserve">날씨계수 0.14466, 일반 상품 0.00136</w:t>
             </w:r>
           </w:p>
         </w:tc>
@@ -6709,7 +6709,7 @@
           <w:b/>
           <w:color w:val="9C4A00"/>
         </w:rPr>
-        <w:t xml:space="preserve">중요: 위 계수는 EBM이 학습한 가격 가중치가 아니다. 서비스 운영 정책으로 코드에 설정된 계수다. EBM이 학습하는 부분은 지역 방문수요뿐이다.</w:t>
+        <w:t xml:space="preserve">중요: 위 계수는 실제 구매데이터로 학습한 가격탄력성이 아니다. 합성 페르소나 시뮬레이션의 시간순 학습구간에서 4단계 탐색으로 보정하고 별도 홀드아웃으로 검증한 초기 정책계수다. EBM이 학습하는 부분은 지역 방문수요다.</w:t>
       </w:r>
     </w:p>
     <w:p>
@@ -6863,7 +6863,7 @@
           <w:szCs w:val="18"/>
           <w:color w:val="333333"/>
         </w:rPr>
-        <w:t xml:space="preserve">pressure = 0.08 + 0.79×0.12 + 0.75×0.10 - 0.2×0.12 + 0.5×0.15 + 0.1×0.03</w:t>
+        <w:t xml:space="preserve">pressure = 0.10417 + 0.79×0.18882 + 0.75×0.21873 - 0.2×0.11487 + 0.5×0.10391 + 0.1×0.00136</w:t>
       </w:r>
     </w:p>
     <w:p>
@@ -6879,7 +6879,7 @@
           <w:szCs w:val="18"/>
           <w:color w:val="333333"/>
         </w:rPr>
-        <w:t xml:space="preserve">         ≈ 0.304</w:t>
+        <w:t xml:space="preserve">         ≈ 0.447</w:t>
       </w:r>
     </w:p>
     <w:p>
@@ -6895,7 +6895,7 @@
           <w:szCs w:val="18"/>
           <w:color w:val="333333"/>
         </w:rPr>
-        <w:t xml:space="preserve">position = (0.304-0.03)/0.62 ≈ 0.442</w:t>
+        <w:t xml:space="preserve">position = (0.447-0.03)/0.62 ≈ 0.672</w:t>
       </w:r>
     </w:p>
     <w:p>
@@ -6911,7 +6911,7 @@
           <w:szCs w:val="18"/>
           <w:color w:val="333333"/>
         </w:rPr>
-        <w:t xml:space="preserve">추천가 = 20,000 - 0.442×10,000 ≈ 15,600원</w:t>
+        <w:t xml:space="preserve">추천가 = 20,000 - 0.672×10,000 ≈ 13,300원</w:t>
       </w:r>
     </w:p>
     <w:p>
@@ -9789,7 +9789,7 @@
                 <w:szCs w:val="18"/>
                 <w:color w:val="222222"/>
               </w:rPr>
-              <w:t xml:space="preserve">최종 가격은 학습 모델이 아니라 정책식</w:t>
+              <w:t xml:space="preserve">최종 가격은 정책식</w:t>
             </w:r>
           </w:p>
         </w:tc>
@@ -9815,7 +9815,7 @@
                 <w:szCs w:val="18"/>
                 <w:color w:val="222222"/>
               </w:rPr>
-              <w:t xml:space="preserve">실제 매출·전환율로 최적 계수를 학습한 상태가 아님</w:t>
+              <w:t xml:space="preserve">합성 페르소나로 보정했으나 실제 매출·전환율 기반 가격탄력성은 아직 미학습</w:t>
             </w:r>
           </w:p>
         </w:tc>

</xml_diff>